<commit_message>
updated resume with portfolio url
</commit_message>
<xml_diff>
--- a/public/resume/Rajat_Kumar_Resume.docx
+++ b/public/resume/Rajat_Kumar_Resume.docx
@@ -92,7 +92,7 @@
         <w:spacing w:after="40" w:before="20"/>
         <w:jc w:val="center"/>
       </w:pPr>
-      <w:hyperlink w:history="1" r:id="rId1krlwu3aeczf_lervq_cb">
+      <w:hyperlink w:history="1" r:id="rIdactzhidacwtnlk3a2dflj">
         <w:r>
           <w:rPr>
             <w:rFonts w:ascii="Calibri" w:cs="Calibri" w:eastAsia="Calibri" w:hAnsi="Calibri"/>
@@ -113,7 +113,7 @@
         </w:rPr>
         <w:t xml:space="preserve">  ·  </w:t>
       </w:r>
-      <w:hyperlink w:history="1" r:id="rIdusfyp1tvnsiy4dsp4hne1">
+      <w:hyperlink w:history="1" r:id="rId3hfzcw5lrwraj7vupida-">
         <w:r>
           <w:rPr>
             <w:rFonts w:ascii="Calibri" w:cs="Calibri" w:eastAsia="Calibri" w:hAnsi="Calibri"/>
@@ -123,6 +123,27 @@
             <w:u w:val="single"/>
           </w:rPr>
           <w:t xml:space="preserve">github.com/RJonMshka</w:t>
+        </w:r>
+      </w:hyperlink>
+      <w:r>
+        <w:rPr>
+          <w:rFonts w:ascii="Calibri" w:cs="Calibri" w:eastAsia="Calibri" w:hAnsi="Calibri"/>
+          <w:color w:val="888888"/>
+          <w:sz w:val="18"/>
+          <w:szCs w:val="18"/>
+        </w:rPr>
+        <w:t xml:space="preserve">  ·  </w:t>
+      </w:r>
+      <w:hyperlink w:history="1" r:id="rIdwk9owcej_0-00s40tlrex">
+        <w:r>
+          <w:rPr>
+            <w:rFonts w:ascii="Calibri" w:cs="Calibri" w:eastAsia="Calibri" w:hAnsi="Calibri"/>
+            <w:color w:val="2B5C8A"/>
+            <w:sz w:val="18"/>
+            <w:szCs w:val="18"/>
+            <w:u w:val="single"/>
+          </w:rPr>
+          <w:t xml:space="preserve">thetraversal.vercel.app</w:t>
         </w:r>
       </w:hyperlink>
     </w:p>

</xml_diff>